<commit_message>
feat(legal): pack juridique v3.1 — ajout interdiction reverse engineering
Suite à 4e cycle revue ChatGPT, validation que réversibilité (art. 13.5) et
exclusions plafond responsabilité (art. 12.1 a-g) étaient déjà présentes en v3.

Reste un ajout marginal :

NDA (01_NDA_CONFIDENTIALITE.md) :
- Article 2.3 nouveau : interdiction de rétro-ingénierie (décompilation,
  observation comportementale, reproduction de logique fonctionnelle,
  black-box analysis). Complète art. 2.4 non-réutilisation du savoir-faire.
- Renumérotation : ex-2.3 -> 2.4, ex-2.4 -> 2.5, ex-2.5 -> 2.6, ex-2.6 -> 2.7

Co-Authored-By: Claude Opus 4.7 (1M context) <noreply@anthropic.com>
</commit_message>
<xml_diff>
--- a/legal/freelance/word/01_NDA_CONFIDENTIALITE.docx
+++ b/legal/freelance/word/01_NDA_CONFIDENTIALITE.docx
@@ -660,10 +660,10 @@
         <w:rPr>
           <w:b/>
         </w:rPr>
-        <w:t>Non-réutilisation du savoir-faire et des concepts.</w:t>
-      </w:r>
-      <w:r>
-        <w:t xml:space="preserve"> Au-delà de la protection du code et des données, le Récipiendaire s'interdit, pendant la durée du présent accord et pendant la durée de protection prévue à l'article 5.2 :</w:t>
+        <w:t>Interdiction de rétro-ingénierie (« reverse engineering »).</w:t>
+      </w:r>
+      <w:r>
+        <w:t xml:space="preserve"> Le Récipiendaire s'interdit formellement, pendant la durée du présent accord et pendant la durée de protection prévue à l'article 5.2, d'effectuer ou de faire effectuer, directement ou indirectement, par lui-même ou par un tiers, toute opération de :</w:t>
       </w:r>
     </w:p>
     <w:p/>
@@ -678,16 +678,7 @@
         <w:t xml:space="preserve">a) </w:t>
       </w:r>
       <w:r>
-        <w:t xml:space="preserve">De réutiliser, en totalité ou en partie, les </w:t>
-      </w:r>
-      <w:r>
-        <w:rPr>
-          <w:b/>
-        </w:rPr>
-        <w:t>concepts produits, l'architecture technique, les workflows fonctionnels, les choix de design d'interface (UX/UI), les modèles d'interaction utilisateur, les approches algorithmiques propres à BoosterMail</w:t>
-      </w:r>
-      <w:r>
-        <w:t xml:space="preserve"> (notamment : pipeline de scoring rédactionnel, méthode d'analyse des profils contacts, articulation cuisinier/commis pour la classification des emails, pipeline de classement multi-tiers), pour développer ou contribuer au développement d'un produit ou service tiers ;</w:t>
+        <w:t>Décompilation, désassemblage, ingénierie inverse, observation comportementale, rétro-conception ou analyse statique ou dynamique de tout ou partie du logiciel BoosterMail, dans une finalité autre que celle strictement nécessaire à l'exécution des Prestations confiées par PDLConsulting ;</w:t>
       </w:r>
     </w:p>
     <w:p/>
@@ -702,37 +693,61 @@
         <w:t xml:space="preserve">b) </w:t>
       </w:r>
       <w:r>
-        <w:t>De prétendre, dans toute communication ou démarche commerciale future, à la paternité ou à la co-paternité des concepts ou méthodes propres à BoosterMail dont il aurait eu connaissance dans le cadre des échanges avec PDLConsulting.</w:t>
-      </w:r>
-    </w:p>
-    <w:p/>
-    <w:p>
-      <w:r>
-        <w:t>Cette obligation est distincte et complémentaire de l'interdiction de divulgation prévue à l'article 2.1.</w:t>
-      </w:r>
-    </w:p>
-    <w:p/>
-    <w:p>
-      <w:r>
-        <w:t xml:space="preserve">2.4 </w:t>
+        <w:t xml:space="preserve">Reproduction, même partielle, de la </w:t>
       </w:r>
       <w:r>
         <w:rPr>
           <w:b/>
         </w:rPr>
-        <w:t>Données dérivées, traces et artefacts intermédiaires.</w:t>
-      </w:r>
-      <w:r>
-        <w:t xml:space="preserve"> Toute donnée, trace, fichier, jeu de tests, log, embedding, vecteur, feature, modèle intermédiaire, fine-tuning, dataset constitué ou cache, généré, enrichi, transformé ou dérivé par le Récipiendaire à partir d'Informations Confidentielles dans le cadre de ses échanges avec PDLConsulting (ci-après les « </w:t>
+        <w:t>logique fonctionnelle</w:t>
+      </w:r>
+      <w:r>
+        <w:t xml:space="preserve">, des </w:t>
       </w:r>
       <w:r>
         <w:rPr>
           <w:b/>
         </w:rPr>
-        <w:t>Données Dérivées</w:t>
-      </w:r>
-      <w:r>
-        <w:t xml:space="preserve"> ») :</w:t>
+        <w:t>enchaînements de traitement</w:t>
+      </w:r>
+      <w:r>
+        <w:t xml:space="preserve">, des </w:t>
+      </w:r>
+      <w:r>
+        <w:rPr>
+          <w:b/>
+        </w:rPr>
+        <w:t>interfaces utilisateur</w:t>
+      </w:r>
+      <w:r>
+        <w:t xml:space="preserve">, des </w:t>
+      </w:r>
+      <w:r>
+        <w:rPr>
+          <w:b/>
+        </w:rPr>
+        <w:t>structures de données</w:t>
+      </w:r>
+      <w:r>
+        <w:t xml:space="preserve">, des </w:t>
+      </w:r>
+      <w:r>
+        <w:rPr>
+          <w:b/>
+        </w:rPr>
+        <w:t>prompts d'IA</w:t>
+      </w:r>
+      <w:r>
+        <w:t xml:space="preserve">, des </w:t>
+      </w:r>
+      <w:r>
+        <w:rPr>
+          <w:b/>
+        </w:rPr>
+        <w:t>paramétrages</w:t>
+      </w:r>
+      <w:r>
+        <w:t>, ou de tout autre élément constitutif du logiciel BoosterMail, à des fins de création d'un produit similaire, alternatif ou concurrent ;</w:t>
       </w:r>
     </w:p>
     <w:p/>
@@ -744,53 +759,10 @@
         <w:rPr>
           <w:b/>
         </w:rPr>
-        <w:t xml:space="preserve">a) </w:t>
-      </w:r>
-      <w:r>
-        <w:t>Sont la propriété exclusive de PDLConsulting au même titre que les Informations Confidentielles dont elles dérivent ;</w:t>
-      </w:r>
-    </w:p>
-    <w:p>
-      <w:pPr>
-        <w:ind w:left="454"/>
-      </w:pPr>
-      <w:r>
-        <w:rPr>
-          <w:b/>
-        </w:rPr>
-        <w:t xml:space="preserve">b) </w:t>
-      </w:r>
-      <w:r>
-        <w:t>Sont soumises aux mêmes obligations de confidentialité, de non-divulgation, de non-réutilisation, de restitution et de destruction que les Informations Confidentielles ;</w:t>
-      </w:r>
-    </w:p>
-    <w:p>
-      <w:pPr>
-        <w:ind w:left="454"/>
-      </w:pPr>
-      <w:r>
-        <w:rPr>
-          <w:b/>
-        </w:rPr>
         <w:t xml:space="preserve">c) </w:t>
       </w:r>
       <w:r>
-        <w:t>Ne peuvent être conservées par le Récipiendaire après la fin des échanges avec PDLConsulting, dans les conditions de l'article 5.3.</w:t>
-      </w:r>
-    </w:p>
-    <w:p/>
-    <w:p>
-      <w:r>
-        <w:t xml:space="preserve">2.5 </w:t>
-      </w:r>
-      <w:r>
-        <w:rPr>
-          <w:b/>
-        </w:rPr>
-        <w:t>Interdiction d'usage des Informations Confidentielles pour l'entraînement de modèles d'intelligence artificielle.</w:t>
-      </w:r>
-      <w:r>
-        <w:t xml:space="preserve"> Le Récipiendaire s'interdit formellement, pendant et après la fin des relations entre les Parties, et sans limitation de durée :</w:t>
+        <w:t>Étude méthodique du fonctionnement du logiciel BoosterMail (« black-box analysis ») visant à reproduire ses caractéristiques sans accès direct au code source ;</w:t>
       </w:r>
     </w:p>
     <w:p/>
@@ -802,19 +774,37 @@
         <w:rPr>
           <w:b/>
         </w:rPr>
-        <w:t xml:space="preserve">a) </w:t>
-      </w:r>
-      <w:r>
-        <w:t xml:space="preserve">D'utiliser tout ou partie des Informations Confidentielles ou des Données Dérivées pour entraîner, ajuster (fine-tuning), évaluer ou améliorer </w:t>
+        <w:t xml:space="preserve">d) </w:t>
+      </w:r>
+      <w:r>
+        <w:t>Création, à partir de l'observation du logiciel BoosterMail (en production, en démonstration, ou dans un environnement de test), de toute documentation technique tierce, de spécifications fonctionnelles, ou de schémas d'architecture destinés à un tiers ou à un projet personnel concurrent.</w:t>
+      </w:r>
+    </w:p>
+    <w:p/>
+    <w:p>
+      <w:r>
+        <w:t>La présente interdiction est distincte et complémentaire des obligations de non-divulgation (article 2.1), de non-réutilisation du savoir-faire (article 2.4) et de propriété intellectuelle (article 4) ; elle vise expressément les techniques d'extraction d'informations qui ne reposeraient pas sur la divulgation directe du code, mais sur son observation extérieure.</w:t>
+      </w:r>
+    </w:p>
+    <w:p/>
+    <w:p>
+      <w:r>
+        <w:t>Toute violation du présent article 2.3 est qualifiée de manquement caractérisé au sens de l'article 6 du présent accord.</w:t>
+      </w:r>
+    </w:p>
+    <w:p/>
+    <w:p>
+      <w:r>
+        <w:t xml:space="preserve">2.4 </w:t>
       </w:r>
       <w:r>
         <w:rPr>
           <w:b/>
         </w:rPr>
-        <w:t>tout modèle d'intelligence artificielle</w:t>
-      </w:r>
-      <w:r>
-        <w:t xml:space="preserve"> (modèle de langage, modèle de classification, modèle de plongement vectoriel, modèle multimodal, etc.), que ce soit pour son compte propre, pour celui d'un tiers, ou pour le compte de toute organisation à laquelle il pourrait être lié ;</w:t>
+        <w:t>Non-réutilisation du savoir-faire et des concepts.</w:t>
+      </w:r>
+      <w:r>
+        <w:t xml:space="preserve"> Au-delà de la protection du code et des données, le Récipiendaire s'interdit, pendant la durée du présent accord et pendant la durée de protection prévue à l'article 5.2 :</w:t>
       </w:r>
     </w:p>
     <w:p/>
@@ -826,10 +816,19 @@
         <w:rPr>
           <w:b/>
         </w:rPr>
-        <w:t xml:space="preserve">b) </w:t>
-      </w:r>
-      <w:r>
-        <w:t>De soumettre tout ou partie des Informations Confidentielles ou des Données Dérivées à un service d'intelligence artificielle dont les conditions d'utilisation autorisent, par défaut ou de manière implicite, la conservation, l'analyse ou la réutilisation des contenus à des fins d'entraînement ou d'amélioration du modèle ;</w:t>
+        <w:t xml:space="preserve">a) </w:t>
+      </w:r>
+      <w:r>
+        <w:t xml:space="preserve">De réutiliser, en totalité ou en partie, les </w:t>
+      </w:r>
+      <w:r>
+        <w:rPr>
+          <w:b/>
+        </w:rPr>
+        <w:t>concepts produits, l'architecture technique, les workflows fonctionnels, les choix de design d'interface (UX/UI), les modèles d'interaction utilisateur, les approches algorithmiques propres à BoosterMail</w:t>
+      </w:r>
+      <w:r>
+        <w:t xml:space="preserve"> (notamment : pipeline de scoring rédactionnel, méthode d'analyse des profils contacts, articulation cuisinier/commis pour la classification des emails, pipeline de classement multi-tiers), pour développer ou contribuer au développement d'un produit ou service tiers ;</w:t>
       </w:r>
     </w:p>
     <w:p/>
@@ -841,31 +840,40 @@
         <w:rPr>
           <w:b/>
         </w:rPr>
-        <w:t xml:space="preserve">c) </w:t>
-      </w:r>
-      <w:r>
-        <w:t>De constituer, à partir des Informations Confidentielles ou des Données Dérivées, des jeux de données destinés à être ultérieurement utilisés à des fins d'entraînement de modèles d'IA, à quelque titre que ce soit.</w:t>
+        <w:t xml:space="preserve">b) </w:t>
+      </w:r>
+      <w:r>
+        <w:t>De prétendre, dans toute communication ou démarche commerciale future, à la paternité ou à la co-paternité des concepts ou méthodes propres à BoosterMail dont il aurait eu connaissance dans le cadre des échanges avec PDLConsulting.</w:t>
       </w:r>
     </w:p>
     <w:p/>
     <w:p>
       <w:r>
-        <w:t>Toute violation du présent article 2.5 est qualifiée de manquement caractérisé au sens de l'article 6 du présent accord et expose le Récipiendaire à la clause pénale prévue à l'article 6.2, sans préjudice de la réparation du préjudice supérieur, lequel inclura notamment, le cas échéant, l'évaluation économique de la perte de spécificité concurrentielle subie par PDLConsulting.</w:t>
+        <w:t>Cette obligation est distincte et complémentaire des interdictions de divulgation (article 2.1) et de rétro-ingénierie (article 2.3).</w:t>
       </w:r>
     </w:p>
     <w:p/>
     <w:p>
       <w:r>
-        <w:t xml:space="preserve">2.6 </w:t>
+        <w:t xml:space="preserve">2.5 </w:t>
       </w:r>
       <w:r>
         <w:rPr>
           <w:b/>
         </w:rPr>
-        <w:t>Usage des outils d'intelligence artificielle générative.</w:t>
-      </w:r>
-      <w:r>
-        <w:t xml:space="preserve"> Compte tenu de la nature particulièrement sensible des Informations Confidentielles, le Récipiendaire reconnaît expressément que :</w:t>
+        <w:t>Données dérivées, traces et artefacts intermédiaires.</w:t>
+      </w:r>
+      <w:r>
+        <w:t xml:space="preserve"> Toute donnée, trace, fichier, jeu de tests, log, embedding, vecteur, feature, modèle intermédiaire, fine-tuning, dataset constitué ou cache, généré, enrichi, transformé ou dérivé par le Récipiendaire à partir d'Informations Confidentielles dans le cadre de ses échanges avec PDLConsulting (ci-après les « </w:t>
+      </w:r>
+      <w:r>
+        <w:rPr>
+          <w:b/>
+        </w:rPr>
+        <w:t>Données Dérivées</w:t>
+      </w:r>
+      <w:r>
+        <w:t xml:space="preserve"> ») :</w:t>
       </w:r>
     </w:p>
     <w:p/>
@@ -880,16 +888,50 @@
         <w:t xml:space="preserve">a) </w:t>
       </w:r>
       <w:r>
-        <w:t xml:space="preserve">La transmission, le copier-coller, la soumission ou tout autre usage des Informations Confidentielles dans un service d'intelligence artificielle générative grand public (notamment, sans s'y limiter : ChatGPT, Claude.ai grand public, Gemini, Copilot Chat dans sa version grand public, Mistral Le Chat grand public, ou tout autre service équivalent) constitue une </w:t>
-      </w:r>
+        <w:t>Sont la propriété exclusive de PDLConsulting au même titre que les Informations Confidentielles dont elles dérivent ;</w:t>
+      </w:r>
+    </w:p>
+    <w:p>
+      <w:pPr>
+        <w:ind w:left="454"/>
+      </w:pPr>
       <w:r>
         <w:rPr>
           <w:b/>
         </w:rPr>
-        <w:t>divulgation à un tiers</w:t>
-      </w:r>
-      <w:r>
-        <w:t xml:space="preserve"> au sens du présent accord, susceptible d'engager sa responsabilité ;</w:t>
+        <w:t xml:space="preserve">b) </w:t>
+      </w:r>
+      <w:r>
+        <w:t>Sont soumises aux mêmes obligations de confidentialité, de non-divulgation, de non-réutilisation, de restitution et de destruction que les Informations Confidentielles ;</w:t>
+      </w:r>
+    </w:p>
+    <w:p>
+      <w:pPr>
+        <w:ind w:left="454"/>
+      </w:pPr>
+      <w:r>
+        <w:rPr>
+          <w:b/>
+        </w:rPr>
+        <w:t xml:space="preserve">c) </w:t>
+      </w:r>
+      <w:r>
+        <w:t>Ne peuvent être conservées par le Récipiendaire après la fin des échanges avec PDLConsulting, dans les conditions de l'article 5.3.</w:t>
+      </w:r>
+    </w:p>
+    <w:p/>
+    <w:p>
+      <w:r>
+        <w:t xml:space="preserve">2.6 </w:t>
+      </w:r>
+      <w:r>
+        <w:rPr>
+          <w:b/>
+        </w:rPr>
+        <w:t>Interdiction d'usage des Informations Confidentielles pour l'entraînement de modèles d'intelligence artificielle.</w:t>
+      </w:r>
+      <w:r>
+        <w:t xml:space="preserve"> Le Récipiendaire s'interdit formellement, pendant et après la fin des relations entre les Parties, et sans limitation de durée :</w:t>
       </w:r>
     </w:p>
     <w:p/>
@@ -901,41 +943,19 @@
         <w:rPr>
           <w:b/>
         </w:rPr>
-        <w:t xml:space="preserve">b) </w:t>
-      </w:r>
-      <w:r>
-        <w:t>En conséquence, le Récipiendaire s'interdit formellement de soumettre tout ou partie des Informations Confidentielles à de tels services, sauf si l'outil est :</w:t>
-      </w:r>
-    </w:p>
-    <w:p>
-      <w:pPr>
-        <w:pStyle w:val="ListBullet"/>
-      </w:pPr>
-      <w:r>
-        <w:t xml:space="preserve">couvert par un contrat professionnel garantissant l'absence de réutilisation des données aux fins d'entraînement ou d'amélioration du modèle (par exemple : Claude API avec opt-out, GitHub Copilot Business avec « data sharing » désactivé, ChatGPT Enterprise / Team, ou équivalent), </w:t>
+        <w:t xml:space="preserve">a) </w:t>
+      </w:r>
+      <w:r>
+        <w:t xml:space="preserve">D'utiliser tout ou partie des Informations Confidentielles ou des Données Dérivées pour entraîner, ajuster (fine-tuning), évaluer ou améliorer </w:t>
       </w:r>
       <w:r>
         <w:rPr>
           <w:b/>
         </w:rPr>
-        <w:t>et</w:t>
-      </w:r>
-    </w:p>
-    <w:p>
-      <w:pPr>
-        <w:pStyle w:val="ListBullet"/>
-      </w:pPr>
-      <w:r>
-        <w:t xml:space="preserve">expressément autorisé par PDLConsulting </w:t>
-      </w:r>
-      <w:r>
-        <w:rPr>
-          <w:b/>
-        </w:rPr>
-        <w:t>par écrit</w:t>
-      </w:r>
-      <w:r>
-        <w:t xml:space="preserve"> ;</w:t>
+        <w:t>tout modèle d'intelligence artificielle</w:t>
+      </w:r>
+      <w:r>
+        <w:t xml:space="preserve"> (modèle de langage, modèle de classification, modèle de plongement vectoriel, modèle multimodal, etc.), que ce soit pour son compte propre, pour celui d'un tiers, ou pour le compte de toute organisation à laquelle il pourrait être lié ;</w:t>
       </w:r>
     </w:p>
     <w:p/>
@@ -947,10 +967,10 @@
         <w:rPr>
           <w:b/>
         </w:rPr>
-        <w:t xml:space="preserve">c) </w:t>
-      </w:r>
-      <w:r>
-        <w:t>Le Récipiendaire s'engage à informer préalablement PDLConsulting de la liste exhaustive des outils d'IA qu'il envisage d'utiliser dans le cadre de ses échanges avec PDLConsulting, et à obtenir une autorisation écrite avant chaque ajout ;</w:t>
+        <w:t xml:space="preserve">b) </w:t>
+      </w:r>
+      <w:r>
+        <w:t>De soumettre tout ou partie des Informations Confidentielles ou des Données Dérivées à un service d'intelligence artificielle dont les conditions d'utilisation autorisent, par défaut ou de manière implicite, la conservation, l'analyse ou la réutilisation des contenus à des fins d'entraînement ou d'amélioration du modèle ;</w:t>
       </w:r>
     </w:p>
     <w:p/>
@@ -962,10 +982,131 @@
         <w:rPr>
           <w:b/>
         </w:rPr>
+        <w:t xml:space="preserve">c) </w:t>
+      </w:r>
+      <w:r>
+        <w:t>De constituer, à partir des Informations Confidentielles ou des Données Dérivées, des jeux de données destinés à être ultérieurement utilisés à des fins d'entraînement de modèles d'IA, à quelque titre que ce soit.</w:t>
+      </w:r>
+    </w:p>
+    <w:p/>
+    <w:p>
+      <w:r>
+        <w:t>Toute violation du présent article 2.6 est qualifiée de manquement caractérisé au sens de l'article 6 du présent accord et expose le Récipiendaire à la clause pénale prévue à l'article 6.2, sans préjudice de la réparation du préjudice supérieur, lequel inclura notamment, le cas échéant, l'évaluation économique de la perte de spécificité concurrentielle subie par PDLConsulting.</w:t>
+      </w:r>
+    </w:p>
+    <w:p/>
+    <w:p>
+      <w:r>
+        <w:t xml:space="preserve">2.7 </w:t>
+      </w:r>
+      <w:r>
+        <w:rPr>
+          <w:b/>
+        </w:rPr>
+        <w:t>Usage des outils d'intelligence artificielle générative.</w:t>
+      </w:r>
+      <w:r>
+        <w:t xml:space="preserve"> Compte tenu de la nature particulièrement sensible des Informations Confidentielles, le Récipiendaire reconnaît expressément que :</w:t>
+      </w:r>
+    </w:p>
+    <w:p/>
+    <w:p>
+      <w:pPr>
+        <w:ind w:left="454"/>
+      </w:pPr>
+      <w:r>
+        <w:rPr>
+          <w:b/>
+        </w:rPr>
+        <w:t xml:space="preserve">a) </w:t>
+      </w:r>
+      <w:r>
+        <w:t xml:space="preserve">La transmission, le copier-coller, la soumission ou tout autre usage des Informations Confidentielles dans un service d'intelligence artificielle générative grand public (notamment, sans s'y limiter : ChatGPT, Claude.ai grand public, Gemini, Copilot Chat dans sa version grand public, Mistral Le Chat grand public, ou tout autre service équivalent) constitue une </w:t>
+      </w:r>
+      <w:r>
+        <w:rPr>
+          <w:b/>
+        </w:rPr>
+        <w:t>divulgation à un tiers</w:t>
+      </w:r>
+      <w:r>
+        <w:t xml:space="preserve"> au sens du présent accord, susceptible d'engager sa responsabilité ;</w:t>
+      </w:r>
+    </w:p>
+    <w:p/>
+    <w:p>
+      <w:pPr>
+        <w:ind w:left="454"/>
+      </w:pPr>
+      <w:r>
+        <w:rPr>
+          <w:b/>
+        </w:rPr>
+        <w:t xml:space="preserve">b) </w:t>
+      </w:r>
+      <w:r>
+        <w:t>En conséquence, le Récipiendaire s'interdit formellement de soumettre tout ou partie des Informations Confidentielles à de tels services, sauf si l'outil est :</w:t>
+      </w:r>
+    </w:p>
+    <w:p>
+      <w:pPr>
+        <w:pStyle w:val="ListBullet"/>
+      </w:pPr>
+      <w:r>
+        <w:t xml:space="preserve">couvert par un contrat professionnel garantissant l'absence de réutilisation des données aux fins d'entraînement ou d'amélioration du modèle (par exemple : Claude API avec opt-out, GitHub Copilot Business avec « data sharing » désactivé, ChatGPT Enterprise / Team, ou équivalent), </w:t>
+      </w:r>
+      <w:r>
+        <w:rPr>
+          <w:b/>
+        </w:rPr>
+        <w:t>et</w:t>
+      </w:r>
+    </w:p>
+    <w:p>
+      <w:pPr>
+        <w:pStyle w:val="ListBullet"/>
+      </w:pPr>
+      <w:r>
+        <w:t xml:space="preserve">expressément autorisé par PDLConsulting </w:t>
+      </w:r>
+      <w:r>
+        <w:rPr>
+          <w:b/>
+        </w:rPr>
+        <w:t>par écrit</w:t>
+      </w:r>
+      <w:r>
+        <w:t xml:space="preserve"> ;</w:t>
+      </w:r>
+    </w:p>
+    <w:p/>
+    <w:p>
+      <w:pPr>
+        <w:ind w:left="454"/>
+      </w:pPr>
+      <w:r>
+        <w:rPr>
+          <w:b/>
+        </w:rPr>
+        <w:t xml:space="preserve">c) </w:t>
+      </w:r>
+      <w:r>
+        <w:t>Le Récipiendaire s'engage à informer préalablement PDLConsulting de la liste exhaustive des outils d'IA qu'il envisage d'utiliser dans le cadre de ses échanges avec PDLConsulting, et à obtenir une autorisation écrite avant chaque ajout ;</w:t>
+      </w:r>
+    </w:p>
+    <w:p/>
+    <w:p>
+      <w:pPr>
+        <w:ind w:left="454"/>
+      </w:pPr>
+      <w:r>
+        <w:rPr>
+          <w:b/>
+        </w:rPr>
         <w:t xml:space="preserve">d) </w:t>
       </w:r>
       <w:r>
-        <w:t>Toute violation des dispositions du présent article 2.6 est qualifiée de manquement caractérisé au sens de l'article 6 du présent accord.</w:t>
+        <w:t>Toute violation des dispositions du présent article 2.7 est qualifiée de manquement caractérisé au sens de l'article 6 du présent accord.</w:t>
       </w:r>
     </w:p>
     <w:p/>

</xml_diff>

<commit_message>
chore(legal): identification complete Mikadb LLC — Michael de Brauwer Manager (v3.6)
Renseignement du nom complet du representant Mikadb LLC dans les 4 documents
de signature (NDA, Contrat, DPA, Charte securite) :

- Representant : Michael de Brauwer
- Qualite : Manager

Renseignement aussi dans la clause "key man" (Contrat art. 4.6) :
intervenant nommement designe = Monsieur Michael de Brauwer.

Restent a completer par le representant avant signature :
- Email officiel Mikadb
- Liste outils cloud (DPA art. 3.2.b)

Co-Authored-By: Claude Opus 4.7 (1M context) <noreply@anthropic.com>
</commit_message>
<xml_diff>
--- a/legal/freelance/word/01_NDA_CONFIDENTIALITE.docx
+++ b/legal/freelance/word/01_NDA_CONFIDENTIALITE.docx
@@ -178,7 +178,25 @@
         <w:t>EIN 38-4339760</w:t>
       </w:r>
       <w:r>
-        <w:t>, représentée par [À COMPLÉTER : Monsieur/Madame NOM Prénom] en qualité de [À COMPLÉTER : Manager / Member / Authorized Representative] dûment habilité(e) aux fins des présentes,</w:t>
+        <w:t xml:space="preserve">, représentée par Monsieur </w:t>
+      </w:r>
+      <w:r>
+        <w:rPr>
+          <w:b/>
+        </w:rPr>
+        <w:t>Michael de Brauwer</w:t>
+      </w:r>
+      <w:r>
+        <w:t xml:space="preserve"> en qualité de </w:t>
+      </w:r>
+      <w:r>
+        <w:rPr>
+          <w:b/>
+        </w:rPr>
+        <w:t>Manager</w:t>
+      </w:r>
+      <w:r>
+        <w:t xml:space="preserve"> dûment habilité aux fins des présentes,</w:t>
       </w:r>
     </w:p>
     <w:p/>
@@ -2268,7 +2286,7 @@
           <w:p>
             <w:r/>
             <w:r>
-              <w:t>[À COMPLÉTER : NOM Prénom]</w:t>
+              <w:t>Michael de Brauwer</w:t>
             </w:r>
           </w:p>
         </w:tc>
@@ -2292,7 +2310,7 @@
           <w:p>
             <w:r/>
             <w:r>
-              <w:t>[À COMPLÉTER : Manager / Member]</w:t>
+              <w:t>Manager</w:t>
             </w:r>
           </w:p>
         </w:tc>

</xml_diff>